<commit_message>
Make move framework table compact and landscape
Co-authored-by: arena-agent <297053741+arena-agent@users.noreply.github.com>
</commit_message>
<xml_diff>
--- a/midterm-report/move-framework/move_framework_three_line.docx
+++ b/midterm-report/move-framework/move_framework_three_line.docx
@@ -4,16 +4,16 @@
   <w:body>
     <w:p>
       <w:pPr>
-        <w:spacing w:after="160"/>
+        <w:spacing w:after="100"/>
         <w:jc w:val="center"/>
       </w:pPr>
       <w:r>
         <w:rPr>
-          <w:rFonts w:ascii="Times New Roman" w:hAnsi="Times New Roman" w:eastAsia="黑体"/>
+          <w:rFonts w:ascii="Times New Roman" w:hAnsi="Times New Roman" w:eastAsia="宋体"/>
           <w:b/>
-          <w:sz w:val="24"/>
+          <w:sz w:val="21"/>
         </w:rPr>
-        <w:t>外语院系英文About Us文本的10核心语步四方面描述框架</w:t>
+        <w:t>表1  外语院系英文About Us文本的10语步描述框架</w:t>
       </w:r>
     </w:p>
     <w:tbl>
@@ -32,25 +32,26 @@
         </w:tblBorders>
       </w:tblPr>
       <w:tblGrid>
-        <w:gridCol w:w="3050"/>
-        <w:gridCol w:w="3050"/>
-        <w:gridCol w:w="3050"/>
-        <w:gridCol w:w="3050"/>
-        <w:gridCol w:w="3050"/>
+        <w:gridCol w:w="3073"/>
+        <w:gridCol w:w="3073"/>
+        <w:gridCol w:w="3073"/>
+        <w:gridCol w:w="3073"/>
+        <w:gridCol w:w="3073"/>
       </w:tblGrid>
       <w:tr>
         <w:trPr>
           <w:tblHeader w:val="true"/>
+          <w:cantSplit/>
         </w:trPr>
         <w:tc>
           <w:tcPr>
-            <w:tcW w:type="dxa" w:w="2098"/>
+            <w:tcW w:type="dxa" w:w="1984"/>
             <w:vAlign w:val="center"/>
             <w:tcMar>
-              <w:top w:w="70" w:type="dxa"/>
-              <w:start w:w="80" w:type="dxa"/>
-              <w:bottom w:w="70" w:type="dxa"/>
-              <w:end w:w="80" w:type="dxa"/>
+              <w:top w:w="45" w:type="dxa"/>
+              <w:start w:w="65" w:type="dxa"/>
+              <w:bottom w:w="45" w:type="dxa"/>
+              <w:end w:w="65" w:type="dxa"/>
             </w:tcMar>
             <w:tcBorders>
               <w:bottom w:val="single" w:sz="8" w:space="0" w:color="000000"/>
@@ -59,26 +60,27 @@
           <w:p>
             <w:pPr>
               <w:spacing w:after="0" w:line="240" w:lineRule="auto"/>
+              <w:jc w:val="center"/>
             </w:pPr>
             <w:r>
               <w:rPr>
-                <w:rFonts w:ascii="Times New Roman" w:hAnsi="Times New Roman" w:eastAsia="黑体"/>
+                <w:rFonts w:ascii="Times New Roman" w:hAnsi="Times New Roman" w:eastAsia="宋体"/>
                 <w:b/>
                 <w:sz w:val="18"/>
               </w:rPr>
-              <w:t>语步（Move）</w:t>
+              <w:t>语步</w:t>
             </w:r>
           </w:p>
         </w:tc>
         <w:tc>
           <w:tcPr>
-            <w:tcW w:type="dxa" w:w="3288"/>
+            <w:tcW w:type="dxa" w:w="3118"/>
             <w:vAlign w:val="center"/>
             <w:tcMar>
-              <w:top w:w="70" w:type="dxa"/>
-              <w:start w:w="80" w:type="dxa"/>
-              <w:bottom w:w="70" w:type="dxa"/>
-              <w:end w:w="80" w:type="dxa"/>
+              <w:top w:w="45" w:type="dxa"/>
+              <w:start w:w="65" w:type="dxa"/>
+              <w:bottom w:w="45" w:type="dxa"/>
+              <w:end w:w="65" w:type="dxa"/>
             </w:tcMar>
             <w:tcBorders>
               <w:bottom w:val="single" w:sz="8" w:space="0" w:color="000000"/>
@@ -87,26 +89,27 @@
           <w:p>
             <w:pPr>
               <w:spacing w:after="0" w:line="240" w:lineRule="auto"/>
+              <w:jc w:val="center"/>
             </w:pPr>
             <w:r>
               <w:rPr>
-                <w:rFonts w:ascii="Times New Roman" w:hAnsi="Times New Roman" w:eastAsia="黑体"/>
+                <w:rFonts w:ascii="Times New Roman" w:hAnsi="Times New Roman" w:eastAsia="宋体"/>
                 <w:b/>
                 <w:sz w:val="18"/>
               </w:rPr>
-              <w:t>内容（Content）</w:t>
+              <w:t>主要内容</w:t>
             </w:r>
           </w:p>
         </w:tc>
         <w:tc>
           <w:tcPr>
-            <w:tcW w:type="dxa" w:w="2948"/>
+            <w:tcW w:type="dxa" w:w="2835"/>
             <w:vAlign w:val="center"/>
             <w:tcMar>
-              <w:top w:w="70" w:type="dxa"/>
-              <w:start w:w="80" w:type="dxa"/>
-              <w:bottom w:w="70" w:type="dxa"/>
-              <w:end w:w="80" w:type="dxa"/>
+              <w:top w:w="45" w:type="dxa"/>
+              <w:start w:w="65" w:type="dxa"/>
+              <w:bottom w:w="45" w:type="dxa"/>
+              <w:end w:w="65" w:type="dxa"/>
             </w:tcMar>
             <w:tcBorders>
               <w:bottom w:val="single" w:sz="8" w:space="0" w:color="000000"/>
@@ -115,26 +118,27 @@
           <w:p>
             <w:pPr>
               <w:spacing w:after="0" w:line="240" w:lineRule="auto"/>
+              <w:jc w:val="center"/>
             </w:pPr>
             <w:r>
               <w:rPr>
-                <w:rFonts w:ascii="Times New Roman" w:hAnsi="Times New Roman" w:eastAsia="黑体"/>
+                <w:rFonts w:ascii="Times New Roman" w:hAnsi="Times New Roman" w:eastAsia="宋体"/>
                 <w:b/>
                 <w:sz w:val="18"/>
               </w:rPr>
-              <w:t>交际目的（Communicative purpose）</w:t>
+              <w:t>交际目的</w:t>
             </w:r>
           </w:p>
         </w:tc>
         <w:tc>
           <w:tcPr>
-            <w:tcW w:type="dxa" w:w="2948"/>
+            <w:tcW w:type="dxa" w:w="2721"/>
             <w:vAlign w:val="center"/>
             <w:tcMar>
-              <w:top w:w="70" w:type="dxa"/>
-              <w:start w:w="80" w:type="dxa"/>
-              <w:bottom w:w="70" w:type="dxa"/>
-              <w:end w:w="80" w:type="dxa"/>
+              <w:top w:w="45" w:type="dxa"/>
+              <w:start w:w="65" w:type="dxa"/>
+              <w:bottom w:w="45" w:type="dxa"/>
+              <w:end w:w="65" w:type="dxa"/>
             </w:tcMar>
             <w:tcBorders>
               <w:bottom w:val="single" w:sz="8" w:space="0" w:color="000000"/>
@@ -143,26 +147,27 @@
           <w:p>
             <w:pPr>
               <w:spacing w:after="0" w:line="240" w:lineRule="auto"/>
+              <w:jc w:val="center"/>
             </w:pPr>
             <w:r>
               <w:rPr>
-                <w:rFonts w:ascii="Times New Roman" w:hAnsi="Times New Roman" w:eastAsia="黑体"/>
+                <w:rFonts w:ascii="Times New Roman" w:hAnsi="Times New Roman" w:eastAsia="宋体"/>
                 <w:b/>
                 <w:sz w:val="18"/>
               </w:rPr>
-              <w:t>体裁功能（Genre function）</w:t>
+              <w:t>体裁功能</w:t>
             </w:r>
           </w:p>
         </w:tc>
         <w:tc>
           <w:tcPr>
-            <w:tcW w:type="dxa" w:w="3742"/>
+            <w:tcW w:type="dxa" w:w="4139"/>
             <w:vAlign w:val="center"/>
             <w:tcMar>
-              <w:top w:w="70" w:type="dxa"/>
-              <w:start w:w="80" w:type="dxa"/>
-              <w:bottom w:w="70" w:type="dxa"/>
-              <w:end w:w="80" w:type="dxa"/>
+              <w:top w:w="45" w:type="dxa"/>
+              <w:start w:w="65" w:type="dxa"/>
+              <w:bottom w:w="45" w:type="dxa"/>
+              <w:end w:w="65" w:type="dxa"/>
             </w:tcMar>
             <w:tcBorders>
               <w:bottom w:val="single" w:sz="8" w:space="0" w:color="000000"/>
@@ -171,33 +176,7 @@
           <w:p>
             <w:pPr>
               <w:spacing w:after="0" w:line="240" w:lineRule="auto"/>
-            </w:pPr>
-            <w:r>
-              <w:rPr>
-                <w:rFonts w:ascii="Times New Roman" w:hAnsi="Times New Roman" w:eastAsia="黑体"/>
-                <w:b/>
-                <w:sz w:val="18"/>
-              </w:rPr>
-              <w:t>主要语阶（Main steps）</w:t>
-            </w:r>
-          </w:p>
-        </w:tc>
-      </w:tr>
-      <w:tr>
-        <w:tc>
-          <w:tcPr>
-            <w:tcW w:type="dxa" w:w="2098"/>
-            <w:vAlign w:val="top"/>
-            <w:tcMar>
-              <w:top w:w="70" w:type="dxa"/>
-              <w:start w:w="80" w:type="dxa"/>
-              <w:bottom w:w="70" w:type="dxa"/>
-              <w:end w:w="80" w:type="dxa"/>
-            </w:tcMar>
-          </w:tcPr>
-          <w:p>
-            <w:pPr>
-              <w:spacing w:after="0" w:line="252" w:lineRule="auto"/>
+              <w:jc w:val="center"/>
             </w:pPr>
             <w:r>
               <w:rPr>
@@ -205,24 +184,29 @@
                 <w:b/>
                 <w:sz w:val="18"/>
               </w:rPr>
-              <w:t>M01 界定机构身份、人员组成与组织治理</w:t>
+              <w:t>主要语阶</w:t>
             </w:r>
           </w:p>
         </w:tc>
+      </w:tr>
+      <w:tr>
+        <w:trPr>
+          <w:cantSplit/>
+        </w:trPr>
         <w:tc>
           <w:tcPr>
-            <w:tcW w:type="dxa" w:w="3288"/>
-            <w:vAlign w:val="top"/>
+            <w:tcW w:type="dxa" w:w="1984"/>
+            <w:vAlign w:val="center"/>
             <w:tcMar>
-              <w:top w:w="70" w:type="dxa"/>
-              <w:start w:w="80" w:type="dxa"/>
-              <w:bottom w:w="70" w:type="dxa"/>
-              <w:end w:w="80" w:type="dxa"/>
+              <w:top w:w="45" w:type="dxa"/>
+              <w:start w:w="65" w:type="dxa"/>
+              <w:bottom w:w="45" w:type="dxa"/>
+              <w:end w:w="65" w:type="dxa"/>
             </w:tcMar>
           </w:tcPr>
           <w:p>
             <w:pPr>
-              <w:spacing w:after="0" w:line="252" w:lineRule="auto"/>
+              <w:spacing w:after="0" w:line="240" w:lineRule="auto"/>
             </w:pPr>
             <w:r>
               <w:rPr>
@@ -230,24 +214,24 @@
                 <w:b w:val="0"/>
                 <w:sz w:val="18"/>
               </w:rPr>
-              <w:t>院系的机构性质、校区与上级学院隶属、独特定位，下属系科与研究中心，以及领导、行政人员、师资和学生组成。</w:t>
+              <w:t>M01 机构身份与组织治理</w:t>
             </w:r>
           </w:p>
         </w:tc>
         <w:tc>
           <w:tcPr>
-            <w:tcW w:type="dxa" w:w="2948"/>
-            <w:vAlign w:val="top"/>
+            <w:tcW w:type="dxa" w:w="3118"/>
+            <w:vAlign w:val="center"/>
             <w:tcMar>
-              <w:top w:w="70" w:type="dxa"/>
-              <w:start w:w="80" w:type="dxa"/>
-              <w:bottom w:w="70" w:type="dxa"/>
-              <w:end w:w="80" w:type="dxa"/>
+              <w:top w:w="45" w:type="dxa"/>
+              <w:start w:w="65" w:type="dxa"/>
+              <w:bottom w:w="45" w:type="dxa"/>
+              <w:end w:w="65" w:type="dxa"/>
             </w:tcMar>
           </w:tcPr>
           <w:p>
             <w:pPr>
-              <w:spacing w:after="0" w:line="252" w:lineRule="auto"/>
+              <w:spacing w:after="0" w:line="240" w:lineRule="auto"/>
             </w:pPr>
             <w:r>
               <w:rPr>
@@ -255,24 +239,24 @@
                 <w:b w:val="0"/>
                 <w:sz w:val="18"/>
               </w:rPr>
-              <w:t>说明“我们是谁、隶属哪里、由哪些人员和组织构成”，呈现院系当前的组织形态与治理结构。</w:t>
+              <w:t>机构性质、隶属关系、组织架构及领导、师资与学生组成。</w:t>
             </w:r>
           </w:p>
         </w:tc>
         <w:tc>
           <w:tcPr>
-            <w:tcW w:type="dxa" w:w="2948"/>
-            <w:vAlign w:val="top"/>
+            <w:tcW w:type="dxa" w:w="2835"/>
+            <w:vAlign w:val="center"/>
             <w:tcMar>
-              <w:top w:w="70" w:type="dxa"/>
-              <w:start w:w="80" w:type="dxa"/>
-              <w:bottom w:w="70" w:type="dxa"/>
-              <w:end w:w="80" w:type="dxa"/>
+              <w:top w:w="45" w:type="dxa"/>
+              <w:start w:w="65" w:type="dxa"/>
+              <w:bottom w:w="45" w:type="dxa"/>
+              <w:end w:w="65" w:type="dxa"/>
             </w:tcMar>
           </w:tcPr>
           <w:p>
             <w:pPr>
-              <w:spacing w:after="0" w:line="252" w:lineRule="auto"/>
+              <w:spacing w:after="0" w:line="240" w:lineRule="auto"/>
             </w:pPr>
             <w:r>
               <w:rPr>
@@ -280,24 +264,24 @@
                 <w:b w:val="0"/>
                 <w:sz w:val="18"/>
               </w:rPr>
-              <w:t>为全篇确立机构主体，提供理解其他学术、教学与社会活动信息的组织背景。</w:t>
+              <w:t>界定院系身份及其组织与人员构成。</w:t>
             </w:r>
           </w:p>
         </w:tc>
         <w:tc>
           <w:tcPr>
-            <w:tcW w:type="dxa" w:w="3742"/>
-            <w:vAlign w:val="top"/>
+            <w:tcW w:type="dxa" w:w="2721"/>
+            <w:vAlign w:val="center"/>
             <w:tcMar>
-              <w:top w:w="70" w:type="dxa"/>
-              <w:start w:w="80" w:type="dxa"/>
-              <w:bottom w:w="70" w:type="dxa"/>
-              <w:end w:w="80" w:type="dxa"/>
+              <w:top w:w="45" w:type="dxa"/>
+              <w:start w:w="65" w:type="dxa"/>
+              <w:bottom w:w="45" w:type="dxa"/>
+              <w:end w:w="65" w:type="dxa"/>
             </w:tcMar>
           </w:tcPr>
           <w:p>
             <w:pPr>
-              <w:spacing w:after="0" w:line="252" w:lineRule="auto"/>
+              <w:spacing w:after="0" w:line="240" w:lineRule="auto"/>
             </w:pPr>
             <w:r>
               <w:rPr>
@@ -305,51 +289,24 @@
                 <w:b w:val="0"/>
                 <w:sz w:val="18"/>
               </w:rPr>
-              <w:t>S1 说明机构性质、隶属与定位；S2 呈现下属系科和研究中心；S3 展示组织治理及人员组成。</w:t>
-            </w:r>
-          </w:p>
-        </w:tc>
-      </w:tr>
-      <w:tr>
-        <w:tc>
-          <w:tcPr>
-            <w:tcW w:type="dxa" w:w="2098"/>
-            <w:vAlign w:val="top"/>
-            <w:tcMar>
-              <w:top w:w="70" w:type="dxa"/>
-              <w:start w:w="80" w:type="dxa"/>
-              <w:bottom w:w="70" w:type="dxa"/>
-              <w:end w:w="80" w:type="dxa"/>
-            </w:tcMar>
-          </w:tcPr>
-          <w:p>
-            <w:pPr>
-              <w:spacing w:after="0" w:line="252" w:lineRule="auto"/>
-            </w:pPr>
-            <w:r>
-              <w:rPr>
-                <w:rFonts w:ascii="Times New Roman" w:hAnsi="Times New Roman" w:eastAsia="宋体"/>
-                <w:b/>
-                <w:sz w:val="18"/>
-              </w:rPr>
-              <w:t>M02 追溯历史沿革与学脉敬意</w:t>
+              <w:t>确立机构主体，提供组织背景。</w:t>
             </w:r>
           </w:p>
         </w:tc>
         <w:tc>
           <w:tcPr>
-            <w:tcW w:type="dxa" w:w="3288"/>
-            <w:vAlign w:val="top"/>
+            <w:tcW w:type="dxa" w:w="4139"/>
+            <w:vAlign w:val="center"/>
             <w:tcMar>
-              <w:top w:w="70" w:type="dxa"/>
-              <w:start w:w="80" w:type="dxa"/>
-              <w:bottom w:w="70" w:type="dxa"/>
-              <w:end w:w="80" w:type="dxa"/>
+              <w:top w:w="45" w:type="dxa"/>
+              <w:start w:w="65" w:type="dxa"/>
+              <w:bottom w:w="45" w:type="dxa"/>
+              <w:end w:w="65" w:type="dxa"/>
             </w:tcMar>
           </w:tcPr>
           <w:p>
             <w:pPr>
-              <w:spacing w:after="0" w:line="252" w:lineRule="auto"/>
+              <w:spacing w:after="0" w:line="240" w:lineRule="auto"/>
             </w:pPr>
             <w:r>
               <w:rPr>
@@ -357,24 +314,29 @@
                 <w:b w:val="0"/>
                 <w:sz w:val="18"/>
               </w:rPr>
-              <w:t>院系的创办年份、前身机构、合并更名、迁址复建等历史节点，以及对先贤和已故学者的纪念与学术致敬。</w:t>
+              <w:t>S1 机构定位；S2 组织架构；S3 治理与人员组成。</w:t>
             </w:r>
           </w:p>
         </w:tc>
+      </w:tr>
+      <w:tr>
+        <w:trPr>
+          <w:cantSplit/>
+        </w:trPr>
         <w:tc>
           <w:tcPr>
-            <w:tcW w:type="dxa" w:w="2948"/>
-            <w:vAlign w:val="top"/>
+            <w:tcW w:type="dxa" w:w="1984"/>
+            <w:vAlign w:val="center"/>
             <w:tcMar>
-              <w:top w:w="70" w:type="dxa"/>
-              <w:start w:w="80" w:type="dxa"/>
-              <w:bottom w:w="70" w:type="dxa"/>
-              <w:end w:w="80" w:type="dxa"/>
+              <w:top w:w="45" w:type="dxa"/>
+              <w:start w:w="65" w:type="dxa"/>
+              <w:bottom w:w="45" w:type="dxa"/>
+              <w:end w:w="65" w:type="dxa"/>
             </w:tcMar>
           </w:tcPr>
           <w:p>
             <w:pPr>
-              <w:spacing w:after="0" w:line="252" w:lineRule="auto"/>
+              <w:spacing w:after="0" w:line="240" w:lineRule="auto"/>
             </w:pPr>
             <w:r>
               <w:rPr>
@@ -382,24 +344,24 @@
                 <w:b w:val="0"/>
                 <w:sz w:val="18"/>
               </w:rPr>
-              <w:t>建立院系的历史连续性，维系集体记忆，并通过学术传统与人物贡献说明其历史传承。</w:t>
+              <w:t>M02 历史沿革与学脉传承</w:t>
             </w:r>
           </w:p>
         </w:tc>
         <w:tc>
           <w:tcPr>
-            <w:tcW w:type="dxa" w:w="2948"/>
-            <w:vAlign w:val="top"/>
+            <w:tcW w:type="dxa" w:w="3118"/>
+            <w:vAlign w:val="center"/>
             <w:tcMar>
-              <w:top w:w="70" w:type="dxa"/>
-              <w:start w:w="80" w:type="dxa"/>
-              <w:bottom w:w="70" w:type="dxa"/>
-              <w:end w:w="80" w:type="dxa"/>
+              <w:top w:w="45" w:type="dxa"/>
+              <w:start w:w="65" w:type="dxa"/>
+              <w:bottom w:w="45" w:type="dxa"/>
+              <w:end w:w="65" w:type="dxa"/>
             </w:tcMar>
           </w:tcPr>
           <w:p>
             <w:pPr>
-              <w:spacing w:after="0" w:line="252" w:lineRule="auto"/>
+              <w:spacing w:after="0" w:line="240" w:lineRule="auto"/>
             </w:pPr>
             <w:r>
               <w:rPr>
@@ -407,24 +369,24 @@
                 <w:b w:val="0"/>
                 <w:sz w:val="18"/>
               </w:rPr>
-              <w:t>为机构身份提供时间纵深，构成连接过去与现在的历史合法性叙事。</w:t>
+              <w:t>创办、前身、合并更名等沿革，以及人物纪念与学术传承。</w:t>
             </w:r>
           </w:p>
         </w:tc>
         <w:tc>
           <w:tcPr>
-            <w:tcW w:type="dxa" w:w="3742"/>
-            <w:vAlign w:val="top"/>
+            <w:tcW w:type="dxa" w:w="2835"/>
+            <w:vAlign w:val="center"/>
             <w:tcMar>
-              <w:top w:w="70" w:type="dxa"/>
-              <w:start w:w="80" w:type="dxa"/>
-              <w:bottom w:w="70" w:type="dxa"/>
-              <w:end w:w="80" w:type="dxa"/>
+              <w:top w:w="45" w:type="dxa"/>
+              <w:start w:w="65" w:type="dxa"/>
+              <w:bottom w:w="45" w:type="dxa"/>
+              <w:end w:w="65" w:type="dxa"/>
             </w:tcMar>
           </w:tcPr>
           <w:p>
             <w:pPr>
-              <w:spacing w:after="0" w:line="252" w:lineRule="auto"/>
+              <w:spacing w:after="0" w:line="240" w:lineRule="auto"/>
             </w:pPr>
             <w:r>
               <w:rPr>
@@ -432,51 +394,24 @@
                 <w:b w:val="0"/>
                 <w:sz w:val="18"/>
               </w:rPr>
-              <w:t>S1 追溯创办起源与前身；S2 叙述合并、更名等转型节点；S3 纪念人物并彰显学脉传承。</w:t>
-            </w:r>
-          </w:p>
-        </w:tc>
-      </w:tr>
-      <w:tr>
-        <w:tc>
-          <w:tcPr>
-            <w:tcW w:type="dxa" w:w="2098"/>
-            <w:vAlign w:val="top"/>
-            <w:tcMar>
-              <w:top w:w="70" w:type="dxa"/>
-              <w:start w:w="80" w:type="dxa"/>
-              <w:bottom w:w="70" w:type="dxa"/>
-              <w:end w:w="80" w:type="dxa"/>
-            </w:tcMar>
-          </w:tcPr>
-          <w:p>
-            <w:pPr>
-              <w:spacing w:after="0" w:line="252" w:lineRule="auto"/>
-            </w:pPr>
-            <w:r>
-              <w:rPr>
-                <w:rFonts w:ascii="Times New Roman" w:hAnsi="Times New Roman" w:eastAsia="宋体"/>
-                <w:b/>
-                <w:sz w:val="18"/>
-              </w:rPr>
-              <w:t>M03 宣示使命愿景与公共价值立场</w:t>
+              <w:t>建立历史连续性，维系学术共同体记忆。</w:t>
             </w:r>
           </w:p>
         </w:tc>
         <w:tc>
           <w:tcPr>
-            <w:tcW w:type="dxa" w:w="3288"/>
-            <w:vAlign w:val="top"/>
+            <w:tcW w:type="dxa" w:w="2721"/>
+            <w:vAlign w:val="center"/>
             <w:tcMar>
-              <w:top w:w="70" w:type="dxa"/>
-              <w:start w:w="80" w:type="dxa"/>
-              <w:bottom w:w="70" w:type="dxa"/>
-              <w:end w:w="80" w:type="dxa"/>
+              <w:top w:w="45" w:type="dxa"/>
+              <w:start w:w="65" w:type="dxa"/>
+              <w:bottom w:w="45" w:type="dxa"/>
+              <w:end w:w="65" w:type="dxa"/>
             </w:tcMar>
           </w:tcPr>
           <w:p>
             <w:pPr>
-              <w:spacing w:after="0" w:line="252" w:lineRule="auto"/>
+              <w:spacing w:after="0" w:line="240" w:lineRule="auto"/>
             </w:pPr>
             <w:r>
               <w:rPr>
@@ -484,24 +419,24 @@
                 <w:b w:val="0"/>
                 <w:sz w:val="18"/>
               </w:rPr>
-              <w:t>院系的根本使命、学术伦理、多元包容或国家战略担当，未来建设规划，以及对公共议题和历史责任的立场。</w:t>
+              <w:t>以历史传承增强机构身份的连续性。</w:t>
             </w:r>
           </w:p>
         </w:tc>
         <w:tc>
           <w:tcPr>
-            <w:tcW w:type="dxa" w:w="2948"/>
-            <w:vAlign w:val="top"/>
+            <w:tcW w:type="dxa" w:w="4139"/>
+            <w:vAlign w:val="center"/>
             <w:tcMar>
-              <w:top w:w="70" w:type="dxa"/>
-              <w:start w:w="80" w:type="dxa"/>
-              <w:bottom w:w="70" w:type="dxa"/>
-              <w:end w:w="80" w:type="dxa"/>
+              <w:top w:w="45" w:type="dxa"/>
+              <w:start w:w="65" w:type="dxa"/>
+              <w:bottom w:w="45" w:type="dxa"/>
+              <w:end w:w="65" w:type="dxa"/>
             </w:tcMar>
           </w:tcPr>
           <w:p>
             <w:pPr>
-              <w:spacing w:after="0" w:line="252" w:lineRule="auto"/>
+              <w:spacing w:after="0" w:line="240" w:lineRule="auto"/>
             </w:pPr>
             <w:r>
               <w:rPr>
@@ -509,24 +444,29 @@
                 <w:b w:val="0"/>
                 <w:sz w:val="18"/>
               </w:rPr>
-              <w:t>公开说明院系为何存在、坚持何种价值、承担何种公共责任，并宣示未来发展方向。</w:t>
+              <w:t>S1 创办与前身；S2 历史转型；S3 人物纪念与学脉传承。</w:t>
             </w:r>
           </w:p>
         </w:tc>
+      </w:tr>
+      <w:tr>
+        <w:trPr>
+          <w:cantSplit/>
+        </w:trPr>
         <w:tc>
           <w:tcPr>
-            <w:tcW w:type="dxa" w:w="2948"/>
-            <w:vAlign w:val="top"/>
+            <w:tcW w:type="dxa" w:w="1984"/>
+            <w:vAlign w:val="center"/>
             <w:tcMar>
-              <w:top w:w="70" w:type="dxa"/>
-              <w:start w:w="80" w:type="dxa"/>
-              <w:bottom w:w="70" w:type="dxa"/>
-              <w:end w:w="80" w:type="dxa"/>
+              <w:top w:w="45" w:type="dxa"/>
+              <w:start w:w="65" w:type="dxa"/>
+              <w:bottom w:w="45" w:type="dxa"/>
+              <w:end w:w="65" w:type="dxa"/>
             </w:tcMar>
           </w:tcPr>
           <w:p>
             <w:pPr>
-              <w:spacing w:after="0" w:line="252" w:lineRule="auto"/>
+              <w:spacing w:after="0" w:line="240" w:lineRule="auto"/>
             </w:pPr>
             <w:r>
               <w:rPr>
@@ -534,24 +474,24 @@
                 <w:b w:val="0"/>
                 <w:sz w:val="18"/>
               </w:rPr>
-              <w:t>为全篇确立价值基调和战略方向，将院系建构为具有使命意识与公共责任的行动主体。</w:t>
+              <w:t>M03 使命愿景与公共价值</w:t>
             </w:r>
           </w:p>
         </w:tc>
         <w:tc>
           <w:tcPr>
-            <w:tcW w:type="dxa" w:w="3742"/>
-            <w:vAlign w:val="top"/>
+            <w:tcW w:type="dxa" w:w="3118"/>
+            <w:vAlign w:val="center"/>
             <w:tcMar>
-              <w:top w:w="70" w:type="dxa"/>
-              <w:start w:w="80" w:type="dxa"/>
-              <w:bottom w:w="70" w:type="dxa"/>
-              <w:end w:w="80" w:type="dxa"/>
+              <w:top w:w="45" w:type="dxa"/>
+              <w:start w:w="65" w:type="dxa"/>
+              <w:bottom w:w="45" w:type="dxa"/>
+              <w:end w:w="65" w:type="dxa"/>
             </w:tcMar>
           </w:tcPr>
           <w:p>
             <w:pPr>
-              <w:spacing w:after="0" w:line="252" w:lineRule="auto"/>
+              <w:spacing w:after="0" w:line="240" w:lineRule="auto"/>
             </w:pPr>
             <w:r>
               <w:rPr>
@@ -559,51 +499,24 @@
                 <w:b w:val="0"/>
                 <w:sz w:val="18"/>
               </w:rPr>
-              <w:t>S1 宣示使命、价值与责任；S2 提出战略愿景和建设计划；S3 回应公共议题并表明道义立场。</w:t>
-            </w:r>
-          </w:p>
-        </w:tc>
-      </w:tr>
-      <w:tr>
-        <w:tc>
-          <w:tcPr>
-            <w:tcW w:type="dxa" w:w="2098"/>
-            <w:vAlign w:val="top"/>
-            <w:tcMar>
-              <w:top w:w="70" w:type="dxa"/>
-              <w:start w:w="80" w:type="dxa"/>
-              <w:bottom w:w="70" w:type="dxa"/>
-              <w:end w:w="80" w:type="dxa"/>
-            </w:tcMar>
-          </w:tcPr>
-          <w:p>
-            <w:pPr>
-              <w:spacing w:after="0" w:line="252" w:lineRule="auto"/>
-            </w:pPr>
-            <w:r>
-              <w:rPr>
-                <w:rFonts w:ascii="Times New Roman" w:hAnsi="Times New Roman" w:eastAsia="宋体"/>
-                <w:b/>
-                <w:sz w:val="18"/>
-              </w:rPr>
-              <w:t>M04 阐释学科价值与学术研究取向</w:t>
+              <w:t>办学使命、价值立场、公共责任及未来愿景与建设规划。</w:t>
             </w:r>
           </w:p>
         </w:tc>
         <w:tc>
           <w:tcPr>
-            <w:tcW w:type="dxa" w:w="3288"/>
-            <w:vAlign w:val="top"/>
+            <w:tcW w:type="dxa" w:w="2835"/>
+            <w:vAlign w:val="center"/>
             <w:tcMar>
-              <w:top w:w="70" w:type="dxa"/>
-              <w:start w:w="80" w:type="dxa"/>
-              <w:bottom w:w="70" w:type="dxa"/>
-              <w:end w:w="80" w:type="dxa"/>
+              <w:top w:w="45" w:type="dxa"/>
+              <w:start w:w="65" w:type="dxa"/>
+              <w:bottom w:w="45" w:type="dxa"/>
+              <w:end w:w="65" w:type="dxa"/>
             </w:tcMar>
           </w:tcPr>
           <w:p>
             <w:pPr>
-              <w:spacing w:after="0" w:line="252" w:lineRule="auto"/>
+              <w:spacing w:after="0" w:line="240" w:lineRule="auto"/>
             </w:pPr>
             <w:r>
               <w:rPr>
@@ -611,24 +524,24 @@
                 <w:b w:val="0"/>
                 <w:sz w:val="18"/>
               </w:rPr>
-              <w:t>语言、文学、文化及区域研究的当代价值，学科核心概念与分析方法，以及院系的研究领域、理论视角和跨学科研究集群。</w:t>
+              <w:t>宣示院系的使命、价值和公共责任。</w:t>
             </w:r>
           </w:p>
         </w:tc>
         <w:tc>
           <w:tcPr>
-            <w:tcW w:type="dxa" w:w="2948"/>
-            <w:vAlign w:val="top"/>
+            <w:tcW w:type="dxa" w:w="2721"/>
+            <w:vAlign w:val="center"/>
             <w:tcMar>
-              <w:top w:w="70" w:type="dxa"/>
-              <w:start w:w="80" w:type="dxa"/>
-              <w:bottom w:w="70" w:type="dxa"/>
-              <w:end w:w="80" w:type="dxa"/>
+              <w:top w:w="45" w:type="dxa"/>
+              <w:start w:w="65" w:type="dxa"/>
+              <w:bottom w:w="45" w:type="dxa"/>
+              <w:end w:w="65" w:type="dxa"/>
             </w:tcMar>
           </w:tcPr>
           <w:p>
             <w:pPr>
-              <w:spacing w:after="0" w:line="252" w:lineRule="auto"/>
+              <w:spacing w:after="0" w:line="240" w:lineRule="auto"/>
             </w:pPr>
             <w:r>
               <w:rPr>
@@ -636,24 +549,24 @@
                 <w:b w:val="0"/>
                 <w:sz w:val="18"/>
               </w:rPr>
-              <w:t>论证相关学科与学习活动的必要性，界定院系的知识生产方式、研究范围和学术取向。</w:t>
+              <w:t>确立全篇的价值基调与战略方向。</w:t>
             </w:r>
           </w:p>
         </w:tc>
         <w:tc>
           <w:tcPr>
-            <w:tcW w:type="dxa" w:w="2948"/>
-            <w:vAlign w:val="top"/>
+            <w:tcW w:type="dxa" w:w="4139"/>
+            <w:vAlign w:val="center"/>
             <w:tcMar>
-              <w:top w:w="70" w:type="dxa"/>
-              <w:start w:w="80" w:type="dxa"/>
-              <w:bottom w:w="70" w:type="dxa"/>
-              <w:end w:w="80" w:type="dxa"/>
+              <w:top w:w="45" w:type="dxa"/>
+              <w:start w:w="65" w:type="dxa"/>
+              <w:bottom w:w="45" w:type="dxa"/>
+              <w:end w:w="65" w:type="dxa"/>
             </w:tcMar>
           </w:tcPr>
           <w:p>
             <w:pPr>
-              <w:spacing w:after="0" w:line="252" w:lineRule="auto"/>
+              <w:spacing w:after="0" w:line="240" w:lineRule="auto"/>
             </w:pPr>
             <w:r>
               <w:rPr>
@@ -661,24 +574,29 @@
                 <w:b w:val="0"/>
                 <w:sz w:val="18"/>
               </w:rPr>
-              <w:t>为院系的学术活动提供知识与研究层面的合法性说明，塑造其学科形象与学术身份。</w:t>
+              <w:t>S1 使命与价值；S2 愿景与规划；S3 公共议题与责任立场。</w:t>
             </w:r>
           </w:p>
         </w:tc>
+      </w:tr>
+      <w:tr>
+        <w:trPr>
+          <w:cantSplit/>
+        </w:trPr>
         <w:tc>
           <w:tcPr>
-            <w:tcW w:type="dxa" w:w="3742"/>
-            <w:vAlign w:val="top"/>
+            <w:tcW w:type="dxa" w:w="1984"/>
+            <w:vAlign w:val="center"/>
             <w:tcMar>
-              <w:top w:w="70" w:type="dxa"/>
-              <w:start w:w="80" w:type="dxa"/>
-              <w:bottom w:w="70" w:type="dxa"/>
-              <w:end w:w="80" w:type="dxa"/>
+              <w:top w:w="45" w:type="dxa"/>
+              <w:start w:w="65" w:type="dxa"/>
+              <w:bottom w:w="45" w:type="dxa"/>
+              <w:end w:w="65" w:type="dxa"/>
             </w:tcMar>
           </w:tcPr>
           <w:p>
             <w:pPr>
-              <w:spacing w:after="0" w:line="252" w:lineRule="auto"/>
+              <w:spacing w:after="0" w:line="240" w:lineRule="auto"/>
             </w:pPr>
             <w:r>
               <w:rPr>
@@ -686,51 +604,24 @@
                 <w:b w:val="0"/>
                 <w:sz w:val="18"/>
               </w:rPr>
-              <w:t>S1 论证学科及学习价值；S2 展示研究领域、方法和跨学科方向；S3 阐释核心概念、方法或学术论点。</w:t>
-            </w:r>
-          </w:p>
-        </w:tc>
-      </w:tr>
-      <w:tr>
-        <w:tc>
-          <w:tcPr>
-            <w:tcW w:type="dxa" w:w="2098"/>
-            <w:vAlign w:val="top"/>
-            <w:tcMar>
-              <w:top w:w="70" w:type="dxa"/>
-              <w:start w:w="80" w:type="dxa"/>
-              <w:bottom w:w="70" w:type="dxa"/>
-              <w:end w:w="80" w:type="dxa"/>
-            </w:tcMar>
-          </w:tcPr>
-          <w:p>
-            <w:pPr>
-              <w:spacing w:after="0" w:line="252" w:lineRule="auto"/>
-            </w:pPr>
-            <w:r>
-              <w:rPr>
-                <w:rFonts w:ascii="Times New Roman" w:hAnsi="Times New Roman" w:eastAsia="宋体"/>
-                <w:b/>
-                <w:sz w:val="18"/>
-              </w:rPr>
-              <w:t>M05 介绍课程供给与教学培养体系</w:t>
+              <w:t>M04 学科价值与研究取向</w:t>
             </w:r>
           </w:p>
         </w:tc>
         <w:tc>
           <w:tcPr>
-            <w:tcW w:type="dxa" w:w="3288"/>
-            <w:vAlign w:val="top"/>
+            <w:tcW w:type="dxa" w:w="3118"/>
+            <w:vAlign w:val="center"/>
             <w:tcMar>
-              <w:top w:w="70" w:type="dxa"/>
-              <w:start w:w="80" w:type="dxa"/>
-              <w:bottom w:w="70" w:type="dxa"/>
-              <w:end w:w="80" w:type="dxa"/>
+              <w:top w:w="45" w:type="dxa"/>
+              <w:start w:w="65" w:type="dxa"/>
+              <w:bottom w:w="45" w:type="dxa"/>
+              <w:end w:w="65" w:type="dxa"/>
             </w:tcMar>
           </w:tcPr>
           <w:p>
             <w:pPr>
-              <w:spacing w:after="0" w:line="252" w:lineRule="auto"/>
+              <w:spacing w:after="0" w:line="240" w:lineRule="auto"/>
             </w:pPr>
             <w:r>
               <w:rPr>
@@ -738,24 +629,24 @@
                 <w:b w:val="0"/>
                 <w:sz w:val="18"/>
               </w:rPr>
-              <w:t>本硕博学位项目、主辅修与证书项目、授课语种和课程模块，以及教学方式、学习体验和学生能力培养目标。</w:t>
+              <w:t>学科与学习价值、研究领域、理论方法及跨学科方向。</w:t>
             </w:r>
           </w:p>
         </w:tc>
         <w:tc>
           <w:tcPr>
-            <w:tcW w:type="dxa" w:w="2948"/>
-            <w:vAlign w:val="top"/>
+            <w:tcW w:type="dxa" w:w="2835"/>
+            <w:vAlign w:val="center"/>
             <w:tcMar>
-              <w:top w:w="70" w:type="dxa"/>
-              <w:start w:w="80" w:type="dxa"/>
-              <w:bottom w:w="70" w:type="dxa"/>
-              <w:end w:w="80" w:type="dxa"/>
+              <w:top w:w="45" w:type="dxa"/>
+              <w:start w:w="65" w:type="dxa"/>
+              <w:bottom w:w="45" w:type="dxa"/>
+              <w:end w:w="65" w:type="dxa"/>
             </w:tcMar>
           </w:tcPr>
           <w:p>
             <w:pPr>
-              <w:spacing w:after="0" w:line="252" w:lineRule="auto"/>
+              <w:spacing w:after="0" w:line="240" w:lineRule="auto"/>
             </w:pPr>
             <w:r>
               <w:rPr>
@@ -763,24 +654,24 @@
                 <w:b w:val="0"/>
                 <w:sz w:val="18"/>
               </w:rPr>
-              <w:t>说明学生“可以学什么、如何学习以及能够形成哪些能力”，呈现院系的教育供给与育人过程。</w:t>
+              <w:t>论证学科意义，界定研究范围与学术取向。</w:t>
             </w:r>
           </w:p>
         </w:tc>
         <w:tc>
           <w:tcPr>
-            <w:tcW w:type="dxa" w:w="2948"/>
-            <w:vAlign w:val="top"/>
+            <w:tcW w:type="dxa" w:w="2721"/>
+            <w:vAlign w:val="center"/>
             <w:tcMar>
-              <w:top w:w="70" w:type="dxa"/>
-              <w:start w:w="80" w:type="dxa"/>
-              <w:bottom w:w="70" w:type="dxa"/>
-              <w:end w:w="80" w:type="dxa"/>
+              <w:top w:w="45" w:type="dxa"/>
+              <w:start w:w="65" w:type="dxa"/>
+              <w:bottom w:w="45" w:type="dxa"/>
+              <w:end w:w="65" w:type="dxa"/>
             </w:tcMar>
           </w:tcPr>
           <w:p>
             <w:pPr>
-              <w:spacing w:after="0" w:line="252" w:lineRule="auto"/>
+              <w:spacing w:after="0" w:line="240" w:lineRule="auto"/>
             </w:pPr>
             <w:r>
               <w:rPr>
@@ -788,24 +679,24 @@
                 <w:b w:val="0"/>
                 <w:sz w:val="18"/>
               </w:rPr>
-              <w:t>将机构使命落实到课程、教学和学习者培养，突出院系作为教育主体的功能。</w:t>
+              <w:t>建构院系的学术合法性与学科形象。</w:t>
             </w:r>
           </w:p>
         </w:tc>
         <w:tc>
           <w:tcPr>
-            <w:tcW w:type="dxa" w:w="3742"/>
-            <w:vAlign w:val="top"/>
+            <w:tcW w:type="dxa" w:w="4139"/>
+            <w:vAlign w:val="center"/>
             <w:tcMar>
-              <w:top w:w="70" w:type="dxa"/>
-              <w:start w:w="80" w:type="dxa"/>
-              <w:bottom w:w="70" w:type="dxa"/>
-              <w:end w:w="80" w:type="dxa"/>
+              <w:top w:w="45" w:type="dxa"/>
+              <w:start w:w="65" w:type="dxa"/>
+              <w:bottom w:w="45" w:type="dxa"/>
+              <w:end w:w="65" w:type="dxa"/>
             </w:tcMar>
           </w:tcPr>
           <w:p>
             <w:pPr>
-              <w:spacing w:after="0" w:line="252" w:lineRule="auto"/>
+              <w:spacing w:after="0" w:line="240" w:lineRule="auto"/>
             </w:pPr>
             <w:r>
               <w:rPr>
@@ -813,51 +704,29 @@
                 <w:b w:val="0"/>
                 <w:sz w:val="18"/>
               </w:rPr>
-              <w:t>S1 介绍学位项目、课程和语种供给；S2 展示教学方式与学习体验；S3 阐明学生能力与素养目标。</w:t>
+              <w:t>S1 学科价值；S2 研究领域与方法；S3 核心概念或学术论点。</w:t>
             </w:r>
           </w:p>
         </w:tc>
       </w:tr>
       <w:tr>
+        <w:trPr>
+          <w:cantSplit/>
+        </w:trPr>
         <w:tc>
           <w:tcPr>
-            <w:tcW w:type="dxa" w:w="2098"/>
-            <w:vAlign w:val="top"/>
+            <w:tcW w:type="dxa" w:w="1984"/>
+            <w:vAlign w:val="center"/>
             <w:tcMar>
-              <w:top w:w="70" w:type="dxa"/>
-              <w:start w:w="80" w:type="dxa"/>
-              <w:bottom w:w="70" w:type="dxa"/>
-              <w:end w:w="80" w:type="dxa"/>
+              <w:top w:w="45" w:type="dxa"/>
+              <w:start w:w="65" w:type="dxa"/>
+              <w:bottom w:w="45" w:type="dxa"/>
+              <w:end w:w="65" w:type="dxa"/>
             </w:tcMar>
           </w:tcPr>
           <w:p>
             <w:pPr>
-              <w:spacing w:after="0" w:line="252" w:lineRule="auto"/>
-            </w:pPr>
-            <w:r>
-              <w:rPr>
-                <w:rFonts w:ascii="Times New Roman" w:hAnsi="Times New Roman" w:eastAsia="宋体"/>
-                <w:b/>
-                <w:sz w:val="18"/>
-              </w:rPr>
-              <w:t>M06 展示师资力量与办学支撑条件</w:t>
-            </w:r>
-          </w:p>
-        </w:tc>
-        <w:tc>
-          <w:tcPr>
-            <w:tcW w:type="dxa" w:w="3288"/>
-            <w:vAlign w:val="top"/>
-            <w:tcMar>
-              <w:top w:w="70" w:type="dxa"/>
-              <w:start w:w="80" w:type="dxa"/>
-              <w:bottom w:w="70" w:type="dxa"/>
-              <w:end w:w="80" w:type="dxa"/>
-            </w:tcMar>
-          </w:tcPr>
-          <w:p>
-            <w:pPr>
-              <w:spacing w:after="0" w:line="252" w:lineRule="auto"/>
+              <w:spacing w:after="0" w:line="240" w:lineRule="auto"/>
             </w:pPr>
             <w:r>
               <w:rPr>
@@ -865,24 +734,24 @@
                 <w:b w:val="0"/>
                 <w:sz w:val="18"/>
               </w:rPr>
-              <w:t>师资规模、学历职称结构与指导力量，图书文献、实验室和数字设施，以及奖助学金、科研支持和学生服务。</w:t>
+              <w:t>M05 课程教学与培养目标</w:t>
             </w:r>
           </w:p>
         </w:tc>
         <w:tc>
           <w:tcPr>
-            <w:tcW w:type="dxa" w:w="2948"/>
-            <w:vAlign w:val="top"/>
+            <w:tcW w:type="dxa" w:w="3118"/>
+            <w:vAlign w:val="center"/>
             <w:tcMar>
-              <w:top w:w="70" w:type="dxa"/>
-              <w:start w:w="80" w:type="dxa"/>
-              <w:bottom w:w="70" w:type="dxa"/>
-              <w:end w:w="80" w:type="dxa"/>
+              <w:top w:w="45" w:type="dxa"/>
+              <w:start w:w="65" w:type="dxa"/>
+              <w:bottom w:w="45" w:type="dxa"/>
+              <w:end w:w="65" w:type="dxa"/>
             </w:tcMar>
           </w:tcPr>
           <w:p>
             <w:pPr>
-              <w:spacing w:after="0" w:line="252" w:lineRule="auto"/>
+              <w:spacing w:after="0" w:line="240" w:lineRule="auto"/>
             </w:pPr>
             <w:r>
               <w:rPr>
@@ -890,24 +759,24 @@
                 <w:b w:val="0"/>
                 <w:sz w:val="18"/>
               </w:rPr>
-              <w:t>证明院系具备开展教学科研和培养学习者所需的人力、物力、财力与服务保障。</w:t>
+              <w:t>学位项目、课程与语种供给、教学方式及学生能力目标。</w:t>
             </w:r>
           </w:p>
         </w:tc>
         <w:tc>
           <w:tcPr>
-            <w:tcW w:type="dxa" w:w="2948"/>
-            <w:vAlign w:val="top"/>
+            <w:tcW w:type="dxa" w:w="2835"/>
+            <w:vAlign w:val="center"/>
             <w:tcMar>
-              <w:top w:w="70" w:type="dxa"/>
-              <w:start w:w="80" w:type="dxa"/>
-              <w:bottom w:w="70" w:type="dxa"/>
-              <w:end w:w="80" w:type="dxa"/>
+              <w:top w:w="45" w:type="dxa"/>
+              <w:start w:w="65" w:type="dxa"/>
+              <w:bottom w:w="45" w:type="dxa"/>
+              <w:end w:w="65" w:type="dxa"/>
             </w:tcMar>
           </w:tcPr>
           <w:p>
             <w:pPr>
-              <w:spacing w:after="0" w:line="252" w:lineRule="auto"/>
+              <w:spacing w:after="0" w:line="240" w:lineRule="auto"/>
             </w:pPr>
             <w:r>
               <w:rPr>
@@ -915,24 +784,24 @@
                 <w:b w:val="0"/>
                 <w:sz w:val="18"/>
               </w:rPr>
-              <w:t>为教学科研承诺提供资源与条件支撑，增强院系自我呈现的可信度和吸引力。</w:t>
+              <w:t>说明学生学什么、如何学以及形成何种能力。</w:t>
             </w:r>
           </w:p>
         </w:tc>
         <w:tc>
           <w:tcPr>
-            <w:tcW w:type="dxa" w:w="3742"/>
-            <w:vAlign w:val="top"/>
+            <w:tcW w:type="dxa" w:w="2721"/>
+            <w:vAlign w:val="center"/>
             <w:tcMar>
-              <w:top w:w="70" w:type="dxa"/>
-              <w:start w:w="80" w:type="dxa"/>
-              <w:bottom w:w="70" w:type="dxa"/>
-              <w:end w:w="80" w:type="dxa"/>
+              <w:top w:w="45" w:type="dxa"/>
+              <w:start w:w="65" w:type="dxa"/>
+              <w:bottom w:w="45" w:type="dxa"/>
+              <w:end w:w="65" w:type="dxa"/>
             </w:tcMar>
           </w:tcPr>
           <w:p>
             <w:pPr>
-              <w:spacing w:after="0" w:line="252" w:lineRule="auto"/>
+              <w:spacing w:after="0" w:line="240" w:lineRule="auto"/>
             </w:pPr>
             <w:r>
               <w:rPr>
@@ -940,51 +809,24 @@
                 <w:b w:val="0"/>
                 <w:sz w:val="18"/>
               </w:rPr>
-              <w:t>S1 展示师资规模与结构；S2 介绍馆藏、实验室和数字设施；S3 说明奖助机会与支持服务。</w:t>
-            </w:r>
-          </w:p>
-        </w:tc>
-      </w:tr>
-      <w:tr>
-        <w:tc>
-          <w:tcPr>
-            <w:tcW w:type="dxa" w:w="2098"/>
-            <w:vAlign w:val="top"/>
-            <w:tcMar>
-              <w:top w:w="70" w:type="dxa"/>
-              <w:start w:w="80" w:type="dxa"/>
-              <w:bottom w:w="70" w:type="dxa"/>
-              <w:end w:w="80" w:type="dxa"/>
-            </w:tcMar>
-          </w:tcPr>
-          <w:p>
-            <w:pPr>
-              <w:spacing w:after="0" w:line="252" w:lineRule="auto"/>
-            </w:pPr>
-            <w:r>
-              <w:rPr>
-                <w:rFonts w:ascii="Times New Roman" w:hAnsi="Times New Roman" w:eastAsia="宋体"/>
-                <w:b/>
-                <w:sz w:val="18"/>
-              </w:rPr>
-              <w:t>M07 证明办学声誉与育人发展成效</w:t>
+              <w:t>将机构使命落实到课程教学与人才培养。</w:t>
             </w:r>
           </w:p>
         </w:tc>
         <w:tc>
           <w:tcPr>
-            <w:tcW w:type="dxa" w:w="3288"/>
-            <w:vAlign w:val="top"/>
+            <w:tcW w:type="dxa" w:w="4139"/>
+            <w:vAlign w:val="center"/>
             <w:tcMar>
-              <w:top w:w="70" w:type="dxa"/>
-              <w:start w:w="80" w:type="dxa"/>
-              <w:bottom w:w="70" w:type="dxa"/>
-              <w:end w:w="80" w:type="dxa"/>
+              <w:top w:w="45" w:type="dxa"/>
+              <w:start w:w="65" w:type="dxa"/>
+              <w:bottom w:w="45" w:type="dxa"/>
+              <w:end w:w="65" w:type="dxa"/>
             </w:tcMar>
           </w:tcPr>
           <w:p>
             <w:pPr>
-              <w:spacing w:after="0" w:line="252" w:lineRule="auto"/>
+              <w:spacing w:after="0" w:line="240" w:lineRule="auto"/>
             </w:pPr>
             <w:r>
               <w:rPr>
@@ -992,24 +834,29 @@
                 <w:b w:val="0"/>
                 <w:sz w:val="18"/>
               </w:rPr>
-              <w:t>学科排名、评估认证和重点资质，科研成果与师生获奖，以及毕业生升学就业、职业发展和杰出校友成就。</w:t>
+              <w:t>S1 项目与课程；S2 教学与学习体验；S3 能力与素养目标。</w:t>
             </w:r>
           </w:p>
         </w:tc>
+      </w:tr>
+      <w:tr>
+        <w:trPr>
+          <w:cantSplit/>
+        </w:trPr>
         <w:tc>
           <w:tcPr>
-            <w:tcW w:type="dxa" w:w="2948"/>
-            <w:vAlign w:val="top"/>
+            <w:tcW w:type="dxa" w:w="1984"/>
+            <w:vAlign w:val="center"/>
             <w:tcMar>
-              <w:top w:w="70" w:type="dxa"/>
-              <w:start w:w="80" w:type="dxa"/>
-              <w:bottom w:w="70" w:type="dxa"/>
-              <w:end w:w="80" w:type="dxa"/>
+              <w:top w:w="45" w:type="dxa"/>
+              <w:start w:w="65" w:type="dxa"/>
+              <w:bottom w:w="45" w:type="dxa"/>
+              <w:end w:w="65" w:type="dxa"/>
             </w:tcMar>
           </w:tcPr>
           <w:p>
             <w:pPr>
-              <w:spacing w:after="0" w:line="252" w:lineRule="auto"/>
+              <w:spacing w:after="0" w:line="240" w:lineRule="auto"/>
             </w:pPr>
             <w:r>
               <w:rPr>
@@ -1017,24 +864,24 @@
                 <w:b w:val="0"/>
                 <w:sz w:val="18"/>
               </w:rPr>
-              <w:t>通过已经取得的成果和外部认可，证明院系的学术声誉、办学成效及其对学生发展的价值。</w:t>
+              <w:t>M06 师资与办学支撑</w:t>
             </w:r>
           </w:p>
         </w:tc>
         <w:tc>
           <w:tcPr>
-            <w:tcW w:type="dxa" w:w="2948"/>
-            <w:vAlign w:val="top"/>
+            <w:tcW w:type="dxa" w:w="3118"/>
+            <w:vAlign w:val="center"/>
             <w:tcMar>
-              <w:top w:w="70" w:type="dxa"/>
-              <w:start w:w="80" w:type="dxa"/>
-              <w:bottom w:w="70" w:type="dxa"/>
-              <w:end w:w="80" w:type="dxa"/>
+              <w:top w:w="45" w:type="dxa"/>
+              <w:start w:w="65" w:type="dxa"/>
+              <w:bottom w:w="45" w:type="dxa"/>
+              <w:end w:w="65" w:type="dxa"/>
             </w:tcMar>
           </w:tcPr>
           <w:p>
             <w:pPr>
-              <w:spacing w:after="0" w:line="252" w:lineRule="auto"/>
+              <w:spacing w:after="0" w:line="240" w:lineRule="auto"/>
             </w:pPr>
             <w:r>
               <w:rPr>
@@ -1042,24 +889,24 @@
                 <w:b w:val="0"/>
                 <w:sz w:val="18"/>
               </w:rPr>
-              <w:t>为院系的自我评价提供成果与外部认可证据，同时强化学术声望和教育回报。</w:t>
+              <w:t>师资规模与结构、馆藏和实验设施、奖助及支持服务。</w:t>
             </w:r>
           </w:p>
         </w:tc>
         <w:tc>
           <w:tcPr>
-            <w:tcW w:type="dxa" w:w="3742"/>
-            <w:vAlign w:val="top"/>
+            <w:tcW w:type="dxa" w:w="2835"/>
+            <w:vAlign w:val="center"/>
             <w:tcMar>
-              <w:top w:w="70" w:type="dxa"/>
-              <w:start w:w="80" w:type="dxa"/>
-              <w:bottom w:w="70" w:type="dxa"/>
-              <w:end w:w="80" w:type="dxa"/>
+              <w:top w:w="45" w:type="dxa"/>
+              <w:start w:w="65" w:type="dxa"/>
+              <w:bottom w:w="45" w:type="dxa"/>
+              <w:end w:w="65" w:type="dxa"/>
             </w:tcMar>
           </w:tcPr>
           <w:p>
             <w:pPr>
-              <w:spacing w:after="0" w:line="252" w:lineRule="auto"/>
+              <w:spacing w:after="0" w:line="240" w:lineRule="auto"/>
             </w:pPr>
             <w:r>
               <w:rPr>
@@ -1067,51 +914,24 @@
                 <w:b w:val="0"/>
                 <w:sz w:val="18"/>
               </w:rPr>
-              <w:t>S1 展示排名、认证与资质；S2 呈现科研产出、奖项和声誉；S3 说明毕业去向与校友发展。</w:t>
-            </w:r>
-          </w:p>
-        </w:tc>
-      </w:tr>
-      <w:tr>
-        <w:tc>
-          <w:tcPr>
-            <w:tcW w:type="dxa" w:w="2098"/>
-            <w:vAlign w:val="top"/>
-            <w:tcMar>
-              <w:top w:w="70" w:type="dxa"/>
-              <w:start w:w="80" w:type="dxa"/>
-              <w:bottom w:w="70" w:type="dxa"/>
-              <w:end w:w="80" w:type="dxa"/>
-            </w:tcMar>
-          </w:tcPr>
-          <w:p>
-            <w:pPr>
-              <w:spacing w:after="0" w:line="252" w:lineRule="auto"/>
-            </w:pPr>
-            <w:r>
-              <w:rPr>
-                <w:rFonts w:ascii="Times New Roman" w:hAnsi="Times New Roman" w:eastAsia="宋体"/>
-                <w:b/>
-                <w:sz w:val="18"/>
-              </w:rPr>
-              <w:t>M08 展示合作网络与社会公共服务</w:t>
+              <w:t>证明院系具备教学科研与育人所需的支撑条件。</w:t>
             </w:r>
           </w:p>
         </w:tc>
         <w:tc>
           <w:tcPr>
-            <w:tcW w:type="dxa" w:w="3288"/>
-            <w:vAlign w:val="top"/>
+            <w:tcW w:type="dxa" w:w="2721"/>
+            <w:vAlign w:val="center"/>
             <w:tcMar>
-              <w:top w:w="70" w:type="dxa"/>
-              <w:start w:w="80" w:type="dxa"/>
-              <w:bottom w:w="70" w:type="dxa"/>
-              <w:end w:w="80" w:type="dxa"/>
+              <w:top w:w="45" w:type="dxa"/>
+              <w:start w:w="65" w:type="dxa"/>
+              <w:bottom w:w="45" w:type="dxa"/>
+              <w:end w:w="65" w:type="dxa"/>
             </w:tcMar>
           </w:tcPr>
           <w:p>
             <w:pPr>
-              <w:spacing w:after="0" w:line="252" w:lineRule="auto"/>
+              <w:spacing w:after="0" w:line="240" w:lineRule="auto"/>
             </w:pPr>
             <w:r>
               <w:rPr>
@@ -1119,24 +939,24 @@
                 <w:b w:val="0"/>
                 <w:sz w:val="18"/>
               </w:rPr>
-              <w:t>校际、跨院系、国际及政企合作，学生留学交换、联合培养和访学项目，以及咨政培训、语言测试与文化传播服务。</w:t>
+              <w:t>为办学与育人承诺提供资源证据。</w:t>
             </w:r>
           </w:p>
         </w:tc>
         <w:tc>
           <w:tcPr>
-            <w:tcW w:type="dxa" w:w="2948"/>
-            <w:vAlign w:val="top"/>
+            <w:tcW w:type="dxa" w:w="4139"/>
+            <w:vAlign w:val="center"/>
             <w:tcMar>
-              <w:top w:w="70" w:type="dxa"/>
-              <w:start w:w="80" w:type="dxa"/>
-              <w:bottom w:w="70" w:type="dxa"/>
-              <w:end w:w="80" w:type="dxa"/>
+              <w:top w:w="45" w:type="dxa"/>
+              <w:start w:w="65" w:type="dxa"/>
+              <w:bottom w:w="45" w:type="dxa"/>
+              <w:end w:w="65" w:type="dxa"/>
             </w:tcMar>
           </w:tcPr>
           <w:p>
             <w:pPr>
-              <w:spacing w:after="0" w:line="252" w:lineRule="auto"/>
+              <w:spacing w:after="0" w:line="240" w:lineRule="auto"/>
             </w:pPr>
             <w:r>
               <w:rPr>
@@ -1144,24 +964,29 @@
                 <w:b w:val="0"/>
                 <w:sz w:val="18"/>
               </w:rPr>
-              <w:t>展示院系如何建立国内外合作关系，并通过专业知识开展社会服务和公共贡献。</w:t>
+              <w:t>S1 师资；S2 设施；S3 奖助与支持服务。</w:t>
             </w:r>
           </w:p>
         </w:tc>
+      </w:tr>
+      <w:tr>
+        <w:trPr>
+          <w:cantSplit/>
+        </w:trPr>
         <w:tc>
           <w:tcPr>
-            <w:tcW w:type="dxa" w:w="2948"/>
-            <w:vAlign w:val="top"/>
+            <w:tcW w:type="dxa" w:w="1984"/>
+            <w:vAlign w:val="center"/>
             <w:tcMar>
-              <w:top w:w="70" w:type="dxa"/>
-              <w:start w:w="80" w:type="dxa"/>
-              <w:bottom w:w="70" w:type="dxa"/>
-              <w:end w:w="80" w:type="dxa"/>
+              <w:top w:w="45" w:type="dxa"/>
+              <w:start w:w="65" w:type="dxa"/>
+              <w:bottom w:w="45" w:type="dxa"/>
+              <w:end w:w="65" w:type="dxa"/>
             </w:tcMar>
           </w:tcPr>
           <w:p>
             <w:pPr>
-              <w:spacing w:after="0" w:line="252" w:lineRule="auto"/>
+              <w:spacing w:after="0" w:line="240" w:lineRule="auto"/>
             </w:pPr>
             <w:r>
               <w:rPr>
@@ -1169,24 +994,24 @@
                 <w:b w:val="0"/>
                 <w:sz w:val="18"/>
               </w:rPr>
-              <w:t>将机构形象由校园内部延伸至国际合作和公共服务网络，突出其开放性与社会参与。</w:t>
+              <w:t>M07 办学声誉与育人成效</w:t>
             </w:r>
           </w:p>
         </w:tc>
         <w:tc>
           <w:tcPr>
-            <w:tcW w:type="dxa" w:w="3742"/>
-            <w:vAlign w:val="top"/>
+            <w:tcW w:type="dxa" w:w="3118"/>
+            <w:vAlign w:val="center"/>
             <w:tcMar>
-              <w:top w:w="70" w:type="dxa"/>
-              <w:start w:w="80" w:type="dxa"/>
-              <w:bottom w:w="70" w:type="dxa"/>
-              <w:end w:w="80" w:type="dxa"/>
+              <w:top w:w="45" w:type="dxa"/>
+              <w:start w:w="65" w:type="dxa"/>
+              <w:bottom w:w="45" w:type="dxa"/>
+              <w:end w:w="65" w:type="dxa"/>
             </w:tcMar>
           </w:tcPr>
           <w:p>
             <w:pPr>
-              <w:spacing w:after="0" w:line="252" w:lineRule="auto"/>
+              <w:spacing w:after="0" w:line="240" w:lineRule="auto"/>
             </w:pPr>
             <w:r>
               <w:rPr>
@@ -1194,51 +1019,24 @@
                 <w:b w:val="0"/>
                 <w:sz w:val="18"/>
               </w:rPr>
-              <w:t>S1 展示合作与学术联盟；S2 介绍交换、联合培养和访学；S3 呈现社会培训、咨政与文化服务。</w:t>
-            </w:r>
-          </w:p>
-        </w:tc>
-      </w:tr>
-      <w:tr>
-        <w:tc>
-          <w:tcPr>
-            <w:tcW w:type="dxa" w:w="2098"/>
-            <w:vAlign w:val="top"/>
-            <w:tcMar>
-              <w:top w:w="70" w:type="dxa"/>
-              <w:start w:w="80" w:type="dxa"/>
-              <w:bottom w:w="70" w:type="dxa"/>
-              <w:end w:w="80" w:type="dxa"/>
-            </w:tcMar>
-          </w:tcPr>
-          <w:p>
-            <w:pPr>
-              <w:spacing w:after="0" w:line="252" w:lineRule="auto"/>
-            </w:pPr>
-            <w:r>
-              <w:rPr>
-                <w:rFonts w:ascii="Times New Roman" w:hAnsi="Times New Roman" w:eastAsia="宋体"/>
-                <w:b/>
-                <w:sz w:val="18"/>
-              </w:rPr>
-              <w:t>M09 欢迎受众、引导行动与动员支持</w:t>
+              <w:t>排名认证、科研成果与奖励，以及毕业去向和校友成就。</w:t>
             </w:r>
           </w:p>
         </w:tc>
         <w:tc>
           <w:tcPr>
-            <w:tcW w:type="dxa" w:w="3288"/>
-            <w:vAlign w:val="top"/>
+            <w:tcW w:type="dxa" w:w="2835"/>
+            <w:vAlign w:val="center"/>
             <w:tcMar>
-              <w:top w:w="70" w:type="dxa"/>
-              <w:start w:w="80" w:type="dxa"/>
-              <w:bottom w:w="70" w:type="dxa"/>
-              <w:end w:w="80" w:type="dxa"/>
+              <w:top w:w="45" w:type="dxa"/>
+              <w:start w:w="65" w:type="dxa"/>
+              <w:bottom w:w="45" w:type="dxa"/>
+              <w:end w:w="65" w:type="dxa"/>
             </w:tcMar>
           </w:tcPr>
           <w:p>
             <w:pPr>
-              <w:spacing w:after="0" w:line="252" w:lineRule="auto"/>
+              <w:spacing w:after="0" w:line="240" w:lineRule="auto"/>
             </w:pPr>
             <w:r>
               <w:rPr>
@@ -1246,24 +1044,24 @@
                 <w:b w:val="0"/>
                 <w:sz w:val="18"/>
               </w:rPr>
-              <w:t>欢迎与祝愿、共同体归属表达，邀请读者浏览、参访、申请或订阅，以及捐赠倡议、基金用途说明和致谢。</w:t>
+              <w:t>以成果和外部认可证明办学声誉与育人成效。</w:t>
             </w:r>
           </w:p>
         </w:tc>
         <w:tc>
           <w:tcPr>
-            <w:tcW w:type="dxa" w:w="2948"/>
-            <w:vAlign w:val="top"/>
+            <w:tcW w:type="dxa" w:w="2721"/>
+            <w:vAlign w:val="center"/>
             <w:tcMar>
-              <w:top w:w="70" w:type="dxa"/>
-              <w:start w:w="80" w:type="dxa"/>
-              <w:bottom w:w="70" w:type="dxa"/>
-              <w:end w:w="80" w:type="dxa"/>
+              <w:top w:w="45" w:type="dxa"/>
+              <w:start w:w="65" w:type="dxa"/>
+              <w:bottom w:w="45" w:type="dxa"/>
+              <w:end w:w="65" w:type="dxa"/>
             </w:tcMar>
           </w:tcPr>
           <w:p>
             <w:pPr>
-              <w:spacing w:after="0" w:line="252" w:lineRule="auto"/>
+              <w:spacing w:after="0" w:line="240" w:lineRule="auto"/>
             </w:pPr>
             <w:r>
               <w:rPr>
@@ -1271,24 +1069,24 @@
                 <w:b w:val="0"/>
                 <w:sz w:val="18"/>
               </w:rPr>
-              <w:t>直接面向读者建立关系，缩短机构与受众的距离，并促使其进一步参与、申请、互动或提供支持。</w:t>
+              <w:t>强化学术声望及教育回报的可信度。</w:t>
             </w:r>
           </w:p>
         </w:tc>
         <w:tc>
           <w:tcPr>
-            <w:tcW w:type="dxa" w:w="2948"/>
-            <w:vAlign w:val="top"/>
+            <w:tcW w:type="dxa" w:w="4139"/>
+            <w:vAlign w:val="center"/>
             <w:tcMar>
-              <w:top w:w="70" w:type="dxa"/>
-              <w:start w:w="80" w:type="dxa"/>
-              <w:bottom w:w="70" w:type="dxa"/>
-              <w:end w:w="80" w:type="dxa"/>
+              <w:top w:w="45" w:type="dxa"/>
+              <w:start w:w="65" w:type="dxa"/>
+              <w:bottom w:w="45" w:type="dxa"/>
+              <w:end w:w="65" w:type="dxa"/>
             </w:tcMar>
           </w:tcPr>
           <w:p>
             <w:pPr>
-              <w:spacing w:after="0" w:line="252" w:lineRule="auto"/>
+              <w:spacing w:after="0" w:line="240" w:lineRule="auto"/>
             </w:pPr>
             <w:r>
               <w:rPr>
@@ -1296,24 +1094,29 @@
                 <w:b w:val="0"/>
                 <w:sz w:val="18"/>
               </w:rPr>
-              <w:t>建立机构—读者之间的人际联系，将信息阅读转化为浏览、申请、参与或支持等行动。</w:t>
+              <w:t>S1 排名与认证；S2 成果与荣誉；S3 毕业去向与校友发展。</w:t>
             </w:r>
           </w:p>
         </w:tc>
+      </w:tr>
+      <w:tr>
+        <w:trPr>
+          <w:cantSplit/>
+        </w:trPr>
         <w:tc>
           <w:tcPr>
-            <w:tcW w:type="dxa" w:w="3742"/>
-            <w:vAlign w:val="top"/>
+            <w:tcW w:type="dxa" w:w="1984"/>
+            <w:vAlign w:val="center"/>
             <w:tcMar>
-              <w:top w:w="70" w:type="dxa"/>
-              <w:start w:w="80" w:type="dxa"/>
-              <w:bottom w:w="70" w:type="dxa"/>
-              <w:end w:w="80" w:type="dxa"/>
+              <w:top w:w="45" w:type="dxa"/>
+              <w:start w:w="65" w:type="dxa"/>
+              <w:bottom w:w="45" w:type="dxa"/>
+              <w:end w:w="65" w:type="dxa"/>
             </w:tcMar>
           </w:tcPr>
           <w:p>
             <w:pPr>
-              <w:spacing w:after="0" w:line="252" w:lineRule="auto"/>
+              <w:spacing w:after="0" w:line="240" w:lineRule="auto"/>
             </w:pPr>
             <w:r>
               <w:rPr>
@@ -1321,51 +1124,24 @@
                 <w:b w:val="0"/>
                 <w:sz w:val="18"/>
               </w:rPr>
-              <w:t>S1 表达欢迎与共同体归属；S2 邀请浏览、参访、申请或订阅；S3 动员捐赠并说明用途、表达感谢。</w:t>
-            </w:r>
-          </w:p>
-        </w:tc>
-      </w:tr>
-      <w:tr>
-        <w:tc>
-          <w:tcPr>
-            <w:tcW w:type="dxa" w:w="2098"/>
-            <w:vAlign w:val="top"/>
-            <w:tcMar>
-              <w:top w:w="70" w:type="dxa"/>
-              <w:start w:w="80" w:type="dxa"/>
-              <w:bottom w:w="70" w:type="dxa"/>
-              <w:end w:w="80" w:type="dxa"/>
-            </w:tcMar>
-          </w:tcPr>
-          <w:p>
-            <w:pPr>
-              <w:spacing w:after="0" w:line="252" w:lineRule="auto"/>
-            </w:pPr>
-            <w:r>
-              <w:rPr>
-                <w:rFonts w:ascii="Times New Roman" w:hAnsi="Times New Roman" w:eastAsia="宋体"/>
-                <w:b/>
-                <w:sz w:val="18"/>
-              </w:rPr>
-              <w:t>M10 提供信息入口、办事规程与运行通告</w:t>
+              <w:t>M08 合作网络与社会服务</w:t>
             </w:r>
           </w:p>
         </w:tc>
         <w:tc>
           <w:tcPr>
-            <w:tcW w:type="dxa" w:w="3288"/>
-            <w:vAlign w:val="top"/>
+            <w:tcW w:type="dxa" w:w="3118"/>
+            <w:vAlign w:val="center"/>
             <w:tcMar>
-              <w:top w:w="70" w:type="dxa"/>
-              <w:start w:w="80" w:type="dxa"/>
-              <w:bottom w:w="70" w:type="dxa"/>
-              <w:end w:w="80" w:type="dxa"/>
+              <w:top w:w="45" w:type="dxa"/>
+              <w:start w:w="65" w:type="dxa"/>
+              <w:bottom w:w="45" w:type="dxa"/>
+              <w:end w:w="65" w:type="dxa"/>
             </w:tcMar>
           </w:tcPr>
           <w:p>
             <w:pPr>
-              <w:spacing w:after="0" w:line="252" w:lineRule="auto"/>
+              <w:spacing w:after="0" w:line="240" w:lineRule="auto"/>
             </w:pPr>
             <w:r>
               <w:rPr>
@@ -1373,24 +1149,24 @@
                 <w:b w:val="0"/>
                 <w:sz w:val="18"/>
               </w:rPr>
-              <w:t>联系方式、地址和访问入口，招生、学分、申请等规则程序，讲座会议与院系动态，以及权责和授权边界。</w:t>
+              <w:t>校际与国际合作、交换与联合培养，以及社会培训与公共服务。</w:t>
             </w:r>
           </w:p>
         </w:tc>
         <w:tc>
           <w:tcPr>
-            <w:tcW w:type="dxa" w:w="2948"/>
-            <w:vAlign w:val="top"/>
+            <w:tcW w:type="dxa" w:w="2835"/>
+            <w:vAlign w:val="center"/>
             <w:tcMar>
-              <w:top w:w="70" w:type="dxa"/>
-              <w:start w:w="80" w:type="dxa"/>
-              <w:bottom w:w="70" w:type="dxa"/>
-              <w:end w:w="80" w:type="dxa"/>
+              <w:top w:w="45" w:type="dxa"/>
+              <w:start w:w="65" w:type="dxa"/>
+              <w:bottom w:w="45" w:type="dxa"/>
+              <w:end w:w="65" w:type="dxa"/>
             </w:tcMar>
           </w:tcPr>
           <w:p>
             <w:pPr>
-              <w:spacing w:after="0" w:line="252" w:lineRule="auto"/>
+              <w:spacing w:after="0" w:line="240" w:lineRule="auto"/>
             </w:pPr>
             <w:r>
               <w:rPr>
@@ -1398,24 +1174,24 @@
                 <w:b w:val="0"/>
                 <w:sz w:val="18"/>
               </w:rPr>
-              <w:t>帮助读者获取信息、办理事务和了解院系运行，明确相关要求、流程与权责范围。</w:t>
+              <w:t>展示合作关系、交流网络及社会贡献。</w:t>
             </w:r>
           </w:p>
         </w:tc>
         <w:tc>
           <w:tcPr>
-            <w:tcW w:type="dxa" w:w="2948"/>
-            <w:vAlign w:val="top"/>
+            <w:tcW w:type="dxa" w:w="2721"/>
+            <w:vAlign w:val="center"/>
             <w:tcMar>
-              <w:top w:w="70" w:type="dxa"/>
-              <w:start w:w="80" w:type="dxa"/>
-              <w:bottom w:w="70" w:type="dxa"/>
-              <w:end w:w="80" w:type="dxa"/>
+              <w:top w:w="45" w:type="dxa"/>
+              <w:start w:w="65" w:type="dxa"/>
+              <w:bottom w:w="45" w:type="dxa"/>
+              <w:end w:w="65" w:type="dxa"/>
             </w:tcMar>
           </w:tcPr>
           <w:p>
             <w:pPr>
-              <w:spacing w:after="0" w:line="252" w:lineRule="auto"/>
+              <w:spacing w:after="0" w:line="240" w:lineRule="auto"/>
             </w:pPr>
             <w:r>
               <w:rPr>
@@ -1423,24 +1199,24 @@
                 <w:b w:val="0"/>
                 <w:sz w:val="18"/>
               </w:rPr>
-              <w:t>保障网站的信息导引和院系事务运行，为读者查询、申请、联系和参与活动提供实用支持。</w:t>
+              <w:t>将机构形象拓展至国际合作与公共服务。</w:t>
             </w:r>
           </w:p>
         </w:tc>
         <w:tc>
           <w:tcPr>
-            <w:tcW w:type="dxa" w:w="3742"/>
-            <w:vAlign w:val="top"/>
+            <w:tcW w:type="dxa" w:w="4139"/>
+            <w:vAlign w:val="center"/>
             <w:tcMar>
-              <w:top w:w="70" w:type="dxa"/>
-              <w:start w:w="80" w:type="dxa"/>
-              <w:bottom w:w="70" w:type="dxa"/>
-              <w:end w:w="80" w:type="dxa"/>
+              <w:top w:w="45" w:type="dxa"/>
+              <w:start w:w="65" w:type="dxa"/>
+              <w:bottom w:w="45" w:type="dxa"/>
+              <w:end w:w="65" w:type="dxa"/>
             </w:tcMar>
           </w:tcPr>
           <w:p>
             <w:pPr>
-              <w:spacing w:after="0" w:line="252" w:lineRule="auto"/>
+              <w:spacing w:after="0" w:line="240" w:lineRule="auto"/>
             </w:pPr>
             <w:r>
               <w:rPr>
@@ -1448,51 +1224,29 @@
                 <w:b w:val="0"/>
                 <w:sz w:val="18"/>
               </w:rPr>
-              <w:t>S1 提供联系与访问入口；S2 规定资格、要求和办事程序；S3 发布活动与运行通告；S4 说明权责和授权边界。</w:t>
+              <w:t>S1 合作网络；S2 交流与联合培养；S3 社会服务。</w:t>
             </w:r>
           </w:p>
         </w:tc>
       </w:tr>
       <w:tr>
+        <w:trPr>
+          <w:cantSplit/>
+        </w:trPr>
         <w:tc>
           <w:tcPr>
-            <w:tcW w:type="dxa" w:w="2098"/>
-            <w:vAlign w:val="top"/>
+            <w:tcW w:type="dxa" w:w="1984"/>
+            <w:vAlign w:val="center"/>
             <w:tcMar>
-              <w:top w:w="70" w:type="dxa"/>
-              <w:start w:w="80" w:type="dxa"/>
-              <w:bottom w:w="70" w:type="dxa"/>
-              <w:end w:w="80" w:type="dxa"/>
+              <w:top w:w="45" w:type="dxa"/>
+              <w:start w:w="65" w:type="dxa"/>
+              <w:bottom w:w="45" w:type="dxa"/>
+              <w:end w:w="65" w:type="dxa"/>
             </w:tcMar>
           </w:tcPr>
           <w:p>
             <w:pPr>
-              <w:spacing w:after="0" w:line="252" w:lineRule="auto"/>
-            </w:pPr>
-            <w:r>
-              <w:rPr>
-                <w:rFonts w:ascii="Times New Roman" w:hAnsi="Times New Roman" w:eastAsia="宋体"/>
-                <w:b/>
-                <w:sz w:val="18"/>
-              </w:rPr>
-              <w:t>OTHER 非命题网页残片与纯名录过滤项（非语步）</w:t>
-            </w:r>
-          </w:p>
-        </w:tc>
-        <w:tc>
-          <w:tcPr>
-            <w:tcW w:type="dxa" w:w="3288"/>
-            <w:vAlign w:val="top"/>
-            <w:tcMar>
-              <w:top w:w="70" w:type="dxa"/>
-              <w:start w:w="80" w:type="dxa"/>
-              <w:bottom w:w="70" w:type="dxa"/>
-              <w:end w:w="80" w:type="dxa"/>
-            </w:tcMar>
-          </w:tcPr>
-          <w:p>
-            <w:pPr>
-              <w:spacing w:after="0" w:line="252" w:lineRule="auto"/>
+              <w:spacing w:after="0" w:line="240" w:lineRule="auto"/>
             </w:pPr>
             <w:r>
               <w:rPr>
@@ -1500,24 +1254,24 @@
                 <w:b w:val="0"/>
                 <w:sz w:val="18"/>
               </w:rPr>
-              <w:t>仅包括孤立菜单或空节标题、重复页脚导航、乱码、采集备注及无关第三方自述等不构成独立交际命题的内容。</w:t>
+              <w:t>M09 受众互动与行动引导</w:t>
             </w:r>
           </w:p>
         </w:tc>
         <w:tc>
           <w:tcPr>
-            <w:tcW w:type="dxa" w:w="2948"/>
-            <w:vAlign w:val="top"/>
+            <w:tcW w:type="dxa" w:w="3118"/>
+            <w:vAlign w:val="center"/>
             <w:tcMar>
-              <w:top w:w="70" w:type="dxa"/>
-              <w:start w:w="80" w:type="dxa"/>
-              <w:bottom w:w="70" w:type="dxa"/>
-              <w:end w:w="80" w:type="dxa"/>
+              <w:top w:w="45" w:type="dxa"/>
+              <w:start w:w="65" w:type="dxa"/>
+              <w:bottom w:w="45" w:type="dxa"/>
+              <w:end w:w="65" w:type="dxa"/>
             </w:tcMar>
           </w:tcPr>
           <w:p>
             <w:pPr>
-              <w:spacing w:after="0" w:line="252" w:lineRule="auto"/>
+              <w:spacing w:after="0" w:line="240" w:lineRule="auto"/>
             </w:pPr>
             <w:r>
               <w:rPr>
@@ -1525,24 +1279,24 @@
                 <w:b w:val="0"/>
                 <w:sz w:val="18"/>
               </w:rPr>
-              <w:t>标记需要与有效语步文本区分开的网页残余信息，不承担独立的机构自我呈现目的。</w:t>
+              <w:t>欢迎与祝愿，浏览、参访、申请等邀请，以及捐赠和致谢。</w:t>
             </w:r>
           </w:p>
         </w:tc>
         <w:tc>
           <w:tcPr>
-            <w:tcW w:type="dxa" w:w="2948"/>
-            <w:vAlign w:val="top"/>
+            <w:tcW w:type="dxa" w:w="2835"/>
+            <w:vAlign w:val="center"/>
             <w:tcMar>
-              <w:top w:w="70" w:type="dxa"/>
-              <w:start w:w="80" w:type="dxa"/>
-              <w:bottom w:w="70" w:type="dxa"/>
-              <w:end w:w="80" w:type="dxa"/>
+              <w:top w:w="45" w:type="dxa"/>
+              <w:start w:w="65" w:type="dxa"/>
+              <w:bottom w:w="45" w:type="dxa"/>
+              <w:end w:w="65" w:type="dxa"/>
             </w:tcMar>
           </w:tcPr>
           <w:p>
             <w:pPr>
-              <w:spacing w:after="0" w:line="252" w:lineRule="auto"/>
+              <w:spacing w:after="0" w:line="240" w:lineRule="auto"/>
             </w:pPr>
             <w:r>
               <w:rPr>
@@ -1550,24 +1304,24 @@
                 <w:b w:val="0"/>
                 <w:sz w:val="18"/>
               </w:rPr>
-              <w:t>作为质控类别保留网页边界信息，不参与M01—M10的语步分布统计。</w:t>
+              <w:t>建立读者关系并引导参与、申请或支持。</w:t>
             </w:r>
           </w:p>
         </w:tc>
         <w:tc>
           <w:tcPr>
-            <w:tcW w:type="dxa" w:w="3742"/>
-            <w:vAlign w:val="top"/>
+            <w:tcW w:type="dxa" w:w="2721"/>
+            <w:vAlign w:val="center"/>
             <w:tcMar>
-              <w:top w:w="70" w:type="dxa"/>
-              <w:start w:w="80" w:type="dxa"/>
-              <w:bottom w:w="70" w:type="dxa"/>
-              <w:end w:w="80" w:type="dxa"/>
+              <w:top w:w="45" w:type="dxa"/>
+              <w:start w:w="65" w:type="dxa"/>
+              <w:bottom w:w="45" w:type="dxa"/>
+              <w:end w:w="65" w:type="dxa"/>
             </w:tcMar>
           </w:tcPr>
           <w:p>
             <w:pPr>
-              <w:spacing w:after="0" w:line="252" w:lineRule="auto"/>
+              <w:spacing w:after="0" w:line="240" w:lineRule="auto"/>
             </w:pPr>
             <w:r>
               <w:rPr>
@@ -1575,7 +1329,162 @@
                 <w:b w:val="0"/>
                 <w:sz w:val="18"/>
               </w:rPr>
-              <w:t>O1 孤立导航与空标题；O2 重复页脚菜单；O3 乱码、采集备注和无关第三方文本。</w:t>
+              <w:t>实现机构与读者之间的人际互动。</w:t>
+            </w:r>
+          </w:p>
+        </w:tc>
+        <w:tc>
+          <w:tcPr>
+            <w:tcW w:type="dxa" w:w="4139"/>
+            <w:vAlign w:val="center"/>
+            <w:tcMar>
+              <w:top w:w="45" w:type="dxa"/>
+              <w:start w:w="65" w:type="dxa"/>
+              <w:bottom w:w="45" w:type="dxa"/>
+              <w:end w:w="65" w:type="dxa"/>
+            </w:tcMar>
+          </w:tcPr>
+          <w:p>
+            <w:pPr>
+              <w:spacing w:after="0" w:line="240" w:lineRule="auto"/>
+            </w:pPr>
+            <w:r>
+              <w:rPr>
+                <w:rFonts w:ascii="Times New Roman" w:hAnsi="Times New Roman" w:eastAsia="宋体"/>
+                <w:b w:val="0"/>
+                <w:sz w:val="18"/>
+              </w:rPr>
+              <w:t>S1 欢迎与归属；S2 邀请与行动引导；S3 捐赠动员与致谢。</w:t>
+            </w:r>
+          </w:p>
+        </w:tc>
+      </w:tr>
+      <w:tr>
+        <w:trPr>
+          <w:cantSplit/>
+        </w:trPr>
+        <w:tc>
+          <w:tcPr>
+            <w:tcW w:type="dxa" w:w="1984"/>
+            <w:vAlign w:val="center"/>
+            <w:tcMar>
+              <w:top w:w="45" w:type="dxa"/>
+              <w:start w:w="65" w:type="dxa"/>
+              <w:bottom w:w="45" w:type="dxa"/>
+              <w:end w:w="65" w:type="dxa"/>
+            </w:tcMar>
+          </w:tcPr>
+          <w:p>
+            <w:pPr>
+              <w:spacing w:after="0" w:line="240" w:lineRule="auto"/>
+            </w:pPr>
+            <w:r>
+              <w:rPr>
+                <w:rFonts w:ascii="Times New Roman" w:hAnsi="Times New Roman" w:eastAsia="宋体"/>
+                <w:b w:val="0"/>
+                <w:sz w:val="18"/>
+              </w:rPr>
+              <w:t>M10 信息导引与运行通告</w:t>
+            </w:r>
+          </w:p>
+        </w:tc>
+        <w:tc>
+          <w:tcPr>
+            <w:tcW w:type="dxa" w:w="3118"/>
+            <w:vAlign w:val="center"/>
+            <w:tcMar>
+              <w:top w:w="45" w:type="dxa"/>
+              <w:start w:w="65" w:type="dxa"/>
+              <w:bottom w:w="45" w:type="dxa"/>
+              <w:end w:w="65" w:type="dxa"/>
+            </w:tcMar>
+          </w:tcPr>
+          <w:p>
+            <w:pPr>
+              <w:spacing w:after="0" w:line="240" w:lineRule="auto"/>
+            </w:pPr>
+            <w:r>
+              <w:rPr>
+                <w:rFonts w:ascii="Times New Roman" w:hAnsi="Times New Roman" w:eastAsia="宋体"/>
+                <w:b w:val="0"/>
+                <w:sz w:val="18"/>
+              </w:rPr>
+              <w:t>联系方式与信息入口、办事规程、活动通告及权责说明。</w:t>
+            </w:r>
+          </w:p>
+        </w:tc>
+        <w:tc>
+          <w:tcPr>
+            <w:tcW w:type="dxa" w:w="2835"/>
+            <w:vAlign w:val="center"/>
+            <w:tcMar>
+              <w:top w:w="45" w:type="dxa"/>
+              <w:start w:w="65" w:type="dxa"/>
+              <w:bottom w:w="45" w:type="dxa"/>
+              <w:end w:w="65" w:type="dxa"/>
+            </w:tcMar>
+          </w:tcPr>
+          <w:p>
+            <w:pPr>
+              <w:spacing w:after="0" w:line="240" w:lineRule="auto"/>
+            </w:pPr>
+            <w:r>
+              <w:rPr>
+                <w:rFonts w:ascii="Times New Roman" w:hAnsi="Times New Roman" w:eastAsia="宋体"/>
+                <w:b w:val="0"/>
+                <w:sz w:val="18"/>
+              </w:rPr>
+              <w:t>为读者查询、联系、申请和参与活动提供指引。</w:t>
+            </w:r>
+          </w:p>
+        </w:tc>
+        <w:tc>
+          <w:tcPr>
+            <w:tcW w:type="dxa" w:w="2721"/>
+            <w:vAlign w:val="center"/>
+            <w:tcMar>
+              <w:top w:w="45" w:type="dxa"/>
+              <w:start w:w="65" w:type="dxa"/>
+              <w:bottom w:w="45" w:type="dxa"/>
+              <w:end w:w="65" w:type="dxa"/>
+            </w:tcMar>
+          </w:tcPr>
+          <w:p>
+            <w:pPr>
+              <w:spacing w:after="0" w:line="240" w:lineRule="auto"/>
+            </w:pPr>
+            <w:r>
+              <w:rPr>
+                <w:rFonts w:ascii="Times New Roman" w:hAnsi="Times New Roman" w:eastAsia="宋体"/>
+                <w:b w:val="0"/>
+                <w:sz w:val="18"/>
+              </w:rPr>
+              <w:t>发挥网站导引与院系运行说明作用。</w:t>
+            </w:r>
+          </w:p>
+        </w:tc>
+        <w:tc>
+          <w:tcPr>
+            <w:tcW w:type="dxa" w:w="4139"/>
+            <w:vAlign w:val="center"/>
+            <w:tcMar>
+              <w:top w:w="45" w:type="dxa"/>
+              <w:start w:w="65" w:type="dxa"/>
+              <w:bottom w:w="45" w:type="dxa"/>
+              <w:end w:w="65" w:type="dxa"/>
+            </w:tcMar>
+          </w:tcPr>
+          <w:p>
+            <w:pPr>
+              <w:spacing w:after="0" w:line="240" w:lineRule="auto"/>
+            </w:pPr>
+            <w:r>
+              <w:rPr>
+                <w:rFonts w:ascii="Times New Roman" w:hAnsi="Times New Roman" w:eastAsia="宋体"/>
+                <w:b w:val="0"/>
+                <w:sz w:val="18"/>
+              </w:rPr>
+              <w:t>S1 联系入口；S2 规则程序；S3 动态通告；S4 权责边界。</w:t>
             </w:r>
           </w:p>
         </w:tc>
@@ -1583,20 +1492,20 @@
     </w:tbl>
     <w:p>
       <w:pPr>
-        <w:spacing w:before="120" w:after="0"/>
+        <w:spacing w:before="80" w:after="0"/>
       </w:pPr>
       <w:r>
         <w:rPr>
           <w:rFonts w:ascii="Times New Roman" w:hAnsi="Times New Roman" w:eastAsia="宋体"/>
           <w:b w:val="0"/>
-          <w:sz w:val="18"/>
+          <w:sz w:val="17"/>
         </w:rPr>
-        <w:t>注：本表参照Yu的四方面描述思路，根据本项目《精炼10核心语步编码手册》整理。OTHER为质控类别，不计入10核心语步。</w:t>
+        <w:t>注：参照Yu的四方面描述思路，依据本项目《精炼10核心语步编码手册》整理。OTHER仅用于过滤非命题网页残片，不属于语步类别。</w:t>
       </w:r>
     </w:p>
     <w:sectPr>
       <w:pgSz w:w="16838" w:h="11906" w:orient="landscape"/>
-      <w:pgMar w:top="850" w:right="794" w:bottom="850" w:left="794" w:header="720" w:footer="720" w:gutter="0"/>
+      <w:pgMar w:top="680" w:right="737" w:bottom="680" w:left="737" w:header="720" w:footer="720" w:gutter="0"/>
       <w:cols w:space="720"/>
       <w:docGrid w:linePitch="360"/>
     </w:sectPr>

</xml_diff>